<commit_message>
SEQUOIADBMAINSTREAM-4031， traceFmt 优化函数 code 编码解析
git-svn-id: http://192.168.20.11/sequoiadb/trunk@38659 6121f079-4a18-41d3-8c30-8870a322f2c2
</commit_message>
<xml_diff>
--- a/internal_doc/03.开发设计/Story-trace代码优化.docx
+++ b/internal_doc/03.开发设计/Story-trace代码优化.docx
@@ -17,7 +17,19 @@
         <w:rPr>
           <w:rFonts w:hint="eastAsia"/>
         </w:rPr>
-        <w:t>优化</w:t>
+        <w:t>优化函数</w:t>
+      </w:r>
+      <w:r>
+        <w:rPr>
+          <w:rFonts w:hint="eastAsia"/>
+        </w:rPr>
+        <w:t xml:space="preserve"> code </w:t>
+      </w:r>
+      <w:r>
+        <w:rPr>
+          <w:rFonts w:hint="eastAsia"/>
+        </w:rPr>
+        <w:t>编码解析</w:t>
       </w:r>
     </w:p>
     <w:tbl>
@@ -110,6 +122,12 @@
               <w:spacing w:line="360" w:lineRule="auto"/>
               <w:ind w:left="0"/>
             </w:pPr>
+            <w:r>
+              <w:rPr>
+                <w:rFonts w:hint="eastAsia"/>
+              </w:rPr>
+              <w:t>2018-12-28  fangjiabin</w:t>
+            </w:r>
           </w:p>
         </w:tc>
         <w:tc>
@@ -121,6 +139,15 @@
               <w:spacing w:line="360" w:lineRule="auto"/>
               <w:ind w:left="0"/>
             </w:pPr>
+            <w:r>
+              <w:t>U</w:t>
+            </w:r>
+            <w:r>
+              <w:rPr>
+                <w:rFonts w:hint="eastAsia"/>
+              </w:rPr>
+              <w:t>pdate</w:t>
+            </w:r>
           </w:p>
         </w:tc>
       </w:tr>
@@ -455,7 +482,14 @@
           <w:rFonts w:asciiTheme="minorEastAsia" w:hAnsiTheme="minorEastAsia" w:hint="eastAsia"/>
           <w:bCs/>
         </w:rPr>
-        <w:t xml:space="preserve">, &lt; parseType &gt; </w:t>
+        <w:t>, [ option ]</w:t>
+      </w:r>
+      <w:r>
+        <w:rPr>
+          <w:rFonts w:asciiTheme="minorEastAsia" w:hAnsiTheme="minorEastAsia" w:hint="eastAsia"/>
+          <w:bCs/>
+        </w:rPr>
+        <w:t xml:space="preserve"> </w:t>
       </w:r>
       <w:r>
         <w:rPr>
@@ -483,24 +517,27 @@
         <w:rPr>
           <w:rFonts w:asciiTheme="minorEastAsia" w:hAnsiTheme="minorEastAsia" w:hint="eastAsia"/>
         </w:rPr>
-        <w:t xml:space="preserve"> 接口新增加一个参数</w:t>
+        <w:t xml:space="preserve"> 接口新增加一个</w:t>
       </w:r>
       <w:r>
         <w:rPr>
           <w:rFonts w:asciiTheme="minorEastAsia" w:hAnsiTheme="minorEastAsia" w:hint="eastAsia"/>
         </w:rPr>
-        <w:t xml:space="preserve"> parse</w:t>
+        <w:t>可选</w:t>
       </w:r>
       <w:r>
         <w:rPr>
           <w:rFonts w:asciiTheme="minorEastAsia" w:hAnsiTheme="minorEastAsia" w:hint="eastAsia"/>
         </w:rPr>
-        <w:t xml:space="preserve">Type ，可选值为 0 和 1，默认为 1 </w:t>
+        <w:t xml:space="preserve">参数 </w:t>
       </w:r>
     </w:p>
     <w:p>
       <w:pPr>
         <w:spacing w:line="360" w:lineRule="auto"/>
+        <w:rPr>
+          <w:rFonts w:asciiTheme="minorEastAsia" w:hAnsiTheme="minorEastAsia"/>
+        </w:rPr>
       </w:pPr>
       <w:r>
         <w:rPr>
@@ -512,13 +549,31 @@
         <w:rPr>
           <w:rFonts w:asciiTheme="minorEastAsia" w:hAnsiTheme="minorEastAsia" w:hint="eastAsia"/>
         </w:rPr>
-        <w:t xml:space="preserve"> parseType </w:t>
+        <w:t xml:space="preserve"> option</w:t>
       </w:r>
       <w:r>
         <w:rPr>
           <w:rFonts w:asciiTheme="minorEastAsia" w:hAnsiTheme="minorEastAsia" w:hint="eastAsia"/>
         </w:rPr>
-        <w:t xml:space="preserve">为 0 </w:t>
+        <w:t xml:space="preserve"> </w:t>
+      </w:r>
+      <w:r>
+        <w:rPr>
+          <w:rFonts w:asciiTheme="minorEastAsia" w:hAnsiTheme="minorEastAsia" w:hint="eastAsia"/>
+        </w:rPr>
+        <w:t>为</w:t>
+      </w:r>
+      <w:r>
+        <w:rPr>
+          <w:rFonts w:asciiTheme="minorEastAsia" w:hAnsiTheme="minorEastAsia" w:hint="eastAsia"/>
+        </w:rPr>
+        <w:t xml:space="preserve"> </w:t>
+      </w:r>
+      <w:r>
+        <w:rPr>
+          <w:rFonts w:hint="eastAsia"/>
+        </w:rPr>
+        <w:t xml:space="preserve">{ FuncList : "file" } </w:t>
       </w:r>
       <w:r>
         <w:rPr>
@@ -565,7 +620,13 @@
         <w:rPr>
           <w:rFonts w:asciiTheme="minorEastAsia" w:hAnsiTheme="minorEastAsia" w:hint="eastAsia"/>
         </w:rPr>
-        <w:t xml:space="preserve">parseType </w:t>
+        <w:t>option</w:t>
+      </w:r>
+      <w:r>
+        <w:rPr>
+          <w:rFonts w:asciiTheme="minorEastAsia" w:hAnsiTheme="minorEastAsia" w:hint="eastAsia"/>
+        </w:rPr>
+        <w:t xml:space="preserve"> </w:t>
       </w:r>
       <w:r>
         <w:rPr>
@@ -577,7 +638,7 @@
         <w:rPr>
           <w:rFonts w:hint="eastAsia"/>
         </w:rPr>
-        <w:t xml:space="preserve"> 1 </w:t>
+        <w:t xml:space="preserve"> { FuncList : "local" } </w:t>
       </w:r>
       <w:r>
         <w:rPr>
@@ -752,7 +813,7 @@
           <v:shape id="_x0000_i1025" type="#_x0000_t75" style="width:286.4pt;height:347.1pt" o:ole="">
             <v:imagedata r:id="rId7" o:title=""/>
           </v:shape>
-          <o:OLEObject Type="Embed" ProgID="Visio.Drawing.11" ShapeID="_x0000_i1025" DrawAspect="Content" ObjectID="_1607510634" r:id="rId8"/>
+          <o:OLEObject Type="Embed" ProgID="Visio.Drawing.11" ShapeID="_x0000_i1025" DrawAspect="Content" ObjectID="_1607522570" r:id="rId8"/>
         </w:object>
       </w:r>
     </w:p>
@@ -789,11 +850,11 @@
         </w:rPr>
       </w:pPr>
       <w:r>
-        <w:object w:dxaOrig="5728" w:dyaOrig="4612">
-          <v:shape id="_x0000_i1026" type="#_x0000_t75" style="width:286.4pt;height:230.5pt" o:ole="">
+        <w:object w:dxaOrig="5728" w:dyaOrig="4611">
+          <v:shape id="_x0000_i1028" type="#_x0000_t75" style="width:286.4pt;height:230.5pt" o:ole="">
             <v:imagedata r:id="rId9" o:title=""/>
           </v:shape>
-          <o:OLEObject Type="Embed" ProgID="Visio.Drawing.11" ShapeID="_x0000_i1026" DrawAspect="Content" ObjectID="_1607510635" r:id="rId10"/>
+          <o:OLEObject Type="Embed" ProgID="Visio.Drawing.11" ShapeID="_x0000_i1028" DrawAspect="Content" ObjectID="_1607522571" r:id="rId10"/>
         </w:object>
       </w:r>
     </w:p>
@@ -999,10 +1060,10 @@
       </w:pPr>
       <w:r>
         <w:object w:dxaOrig="5725" w:dyaOrig="6957">
-          <v:shape id="_x0000_i1029" type="#_x0000_t75" style="width:286.4pt;height:347.65pt" o:ole="">
+          <v:shape id="_x0000_i1026" type="#_x0000_t75" style="width:286.4pt;height:347.65pt" o:ole="">
             <v:imagedata r:id="rId11" o:title=""/>
           </v:shape>
-          <o:OLEObject Type="Embed" ProgID="Visio.Drawing.11" ShapeID="_x0000_i1029" DrawAspect="Content" ObjectID="_1607510636" r:id="rId12"/>
+          <o:OLEObject Type="Embed" ProgID="Visio.Drawing.11" ShapeID="_x0000_i1026" DrawAspect="Content" ObjectID="_1607522572" r:id="rId12"/>
         </w:object>
       </w:r>
     </w:p>
@@ -1030,11 +1091,11 @@
         <w:jc w:val="center"/>
       </w:pPr>
       <w:r>
-        <w:object w:dxaOrig="5728" w:dyaOrig="5852">
-          <v:shape id="_x0000_i1027" type="#_x0000_t75" style="width:286.4pt;height:292.85pt" o:ole="">
+        <w:object w:dxaOrig="5730" w:dyaOrig="7596">
+          <v:shape id="_x0000_i1029" type="#_x0000_t75" style="width:286.4pt;height:379.9pt" o:ole="">
             <v:imagedata r:id="rId13" o:title=""/>
           </v:shape>
-          <o:OLEObject Type="Embed" ProgID="Visio.Drawing.11" ShapeID="_x0000_i1027" DrawAspect="Content" ObjectID="_1607510637" r:id="rId14"/>
+          <o:OLEObject Type="Embed" ProgID="Visio.Drawing.11" ShapeID="_x0000_i1029" DrawAspect="Content" ObjectID="_1607522573" r:id="rId14"/>
         </w:object>
       </w:r>
     </w:p>
@@ -1112,15 +1173,7 @@
           <w:rFonts w:hint="eastAsia"/>
           <w:lang w:val="zh-CN"/>
         </w:rPr>
-        <w:t>存储所有的函</w:t>
-      </w:r>
-      <w:r>
-        <w:rPr>
-          <w:rFonts w:hint="eastAsia"/>
-          <w:lang w:val="zh-CN"/>
-        </w:rPr>
-        <w:lastRenderedPageBreak/>
-        <w:t>数名字符串</w:t>
+        <w:t>存储所有的函数名字符串</w:t>
       </w:r>
       <w:r>
         <w:rPr>
@@ -1182,6 +1235,9 @@
       <w:pPr>
         <w:spacing w:line="360" w:lineRule="auto"/>
         <w:jc w:val="left"/>
+        <w:rPr>
+          <w:rFonts w:hint="eastAsia"/>
+        </w:rPr>
       </w:pPr>
       <w:r>
         <w:rPr>
@@ -1199,7 +1255,31 @@
         <w:rPr>
           <w:rFonts w:hint="eastAsia"/>
         </w:rPr>
-        <w:t xml:space="preserve"> _functionsLen </w:t>
+        <w:t xml:space="preserve"> _</w:t>
+      </w:r>
+      <w:r>
+        <w:rPr>
+          <w:rFonts w:hint="eastAsia"/>
+        </w:rPr>
+        <w:t>_</w:t>
+      </w:r>
+      <w:r>
+        <w:rPr>
+          <w:rFonts w:hint="eastAsia"/>
+        </w:rPr>
+        <w:t xml:space="preserve"> </w:t>
+      </w:r>
+      <w:r>
+        <w:rPr>
+          <w:rFonts w:hint="eastAsia"/>
+        </w:rPr>
+        <w:t>functionsLen</w:t>
+      </w:r>
+      <w:r>
+        <w:rPr>
+          <w:rFonts w:hint="eastAsia"/>
+        </w:rPr>
+        <w:t xml:space="preserve"> </w:t>
       </w:r>
       <w:r>
         <w:rPr>
@@ -1239,6 +1319,31 @@
         <w:rPr>
           <w:rFonts w:hint="eastAsia"/>
         </w:rPr>
+        <w:t xml:space="preserve"> _</w:t>
+      </w:r>
+      <w:r>
+        <w:rPr>
+          <w:rFonts w:hint="eastAsia"/>
+        </w:rPr>
+        <w:t xml:space="preserve">functionsBeginSize </w:t>
+      </w:r>
+      <w:r>
+        <w:rPr>
+          <w:rFonts w:hint="eastAsia"/>
+          <w:lang w:val="zh-CN"/>
+        </w:rPr>
+        <w:t>存储函数名称数组的占用空间大小</w:t>
+      </w:r>
+      <w:r>
+        <w:rPr>
+          <w:rFonts w:hint="eastAsia"/>
+        </w:rPr>
+        <w:t>，</w:t>
+      </w:r>
+      <w:r>
+        <w:rPr>
+          <w:rFonts w:hint="eastAsia"/>
+        </w:rPr>
         <w:t xml:space="preserve"> _engineVersion </w:t>
       </w:r>
       <w:r>
@@ -1246,85 +1351,133 @@
           <w:rFonts w:hint="eastAsia"/>
           <w:lang w:val="zh-CN"/>
         </w:rPr>
-        <w:t>存储当前数据库引擎的版本号。</w:t>
+        <w:t>存储数据库引擎的主版本号</w:t>
+      </w:r>
+      <w:r>
+        <w:rPr>
+          <w:rFonts w:hint="eastAsia"/>
+        </w:rPr>
+        <w:t>，</w:t>
+      </w:r>
+      <w:r>
+        <w:rPr>
+          <w:rFonts w:hint="eastAsia"/>
+        </w:rPr>
+        <w:t xml:space="preserve"> _subVesion </w:t>
       </w:r>
       <w:r>
         <w:rPr>
           <w:rFonts w:hint="eastAsia"/>
           <w:lang w:val="zh-CN"/>
         </w:rPr>
-        <w:t>新设计的二进制文件被解析后，输出文件会记录当前数据库引擎的版本号。</w:t>
+        <w:t>存储子版本号</w:t>
+      </w:r>
+      <w:r>
+        <w:rPr>
+          <w:rFonts w:hint="eastAsia"/>
+        </w:rPr>
+        <w:t>，</w:t>
+      </w:r>
+      <w:r>
+        <w:rPr>
+          <w:rFonts w:hint="eastAsia"/>
+        </w:rPr>
+        <w:t xml:space="preserve"> _fixVersion </w:t>
+      </w:r>
+      <w:r>
+        <w:rPr>
+          <w:rFonts w:hint="eastAsia"/>
+          <w:lang w:val="zh-CN"/>
+        </w:rPr>
+        <w:t>存储修正版本号</w:t>
+      </w:r>
+      <w:r>
+        <w:rPr>
+          <w:rFonts w:hint="eastAsia"/>
+        </w:rPr>
+        <w:t>，</w:t>
+      </w:r>
+      <w:r>
+        <w:rPr>
+          <w:rFonts w:hint="eastAsia"/>
+        </w:rPr>
+        <w:t xml:space="preserve"> </w:t>
+      </w:r>
+      <w:r>
+        <w:rPr>
+          <w:rFonts w:hint="eastAsia"/>
+        </w:rPr>
+        <w:t>_release</w:t>
+      </w:r>
+      <w:r>
+        <w:rPr>
+          <w:rFonts w:hint="eastAsia"/>
+        </w:rPr>
+        <w:t xml:space="preserve"> </w:t>
+      </w:r>
+      <w:r>
+        <w:rPr>
+          <w:rFonts w:hint="eastAsia"/>
+          <w:lang w:val="zh-CN"/>
+        </w:rPr>
+        <w:t>存储</w:t>
+      </w:r>
+      <w:r>
+        <w:rPr>
+          <w:rFonts w:hint="eastAsia"/>
+          <w:lang w:val="zh-CN"/>
+        </w:rPr>
+        <w:t>发行版本号。</w:t>
       </w:r>
     </w:p>
     <w:p>
       <w:pPr>
         <w:spacing w:line="360" w:lineRule="auto"/>
-      </w:pPr>
-      <w:r>
-        <w:rPr>
-          <w:rFonts w:hint="eastAsia"/>
-        </w:rPr>
-        <w:t xml:space="preserve">  traceOff </w:t>
-      </w:r>
-      <w:r>
-        <w:rPr>
-          <w:rFonts w:hint="eastAsia"/>
-        </w:rPr>
-        <w:t>在写入头部信息之后，</w:t>
-      </w:r>
-      <w:r>
-        <w:rPr>
-          <w:rFonts w:hint="eastAsia"/>
-        </w:rPr>
-        <w:t>会</w:t>
-      </w:r>
-      <w:r>
-        <w:rPr>
-          <w:rFonts w:hint="eastAsia"/>
-        </w:rPr>
-        <w:t>读取外部文件的函数名数组，把所有的</w:t>
-      </w:r>
-      <w:r>
-        <w:rPr>
-          <w:rFonts w:hint="eastAsia"/>
-        </w:rPr>
-        <w:t>函数名字符</w:t>
-      </w:r>
-      <w:r>
-        <w:rPr>
-          <w:rFonts w:hint="eastAsia"/>
-        </w:rPr>
-        <w:t>串序列化</w:t>
-      </w:r>
-      <w:r>
-        <w:rPr>
-          <w:rFonts w:hint="eastAsia"/>
-        </w:rPr>
-        <w:t>到文件中，</w:t>
-      </w:r>
-      <w:r>
-        <w:rPr>
-          <w:rFonts w:hint="eastAsia"/>
-        </w:rPr>
-        <w:t>接着</w:t>
-      </w:r>
-      <w:r>
-        <w:rPr>
-          <w:rFonts w:hint="eastAsia"/>
-        </w:rPr>
-        <w:t>再写入</w:t>
-      </w:r>
-      <w:r>
-        <w:rPr>
-          <w:rFonts w:hint="eastAsia"/>
-        </w:rPr>
-        <w:t>跟踪</w:t>
-      </w:r>
-      <w:r>
-        <w:rPr>
-          <w:rFonts w:hint="eastAsia"/>
-        </w:rPr>
-        <w:t>数据。</w:t>
+        <w:jc w:val="left"/>
+      </w:pPr>
+      <w:r>
+        <w:rPr>
+          <w:rFonts w:hint="eastAsia"/>
+        </w:rPr>
+        <w:t xml:space="preserve">  </w:t>
+      </w:r>
+      <w:r>
+        <w:rPr>
+          <w:rFonts w:hint="eastAsia"/>
+          <w:lang w:val="zh-CN"/>
+        </w:rPr>
+        <w:t>所以新设计的文件大小</w:t>
+      </w:r>
+      <w:r>
+        <w:rPr>
+          <w:rFonts w:hint="eastAsia"/>
+          <w:lang w:val="zh-CN"/>
+        </w:rPr>
+        <w:t xml:space="preserve"> = _headerSize + _bufSize + _</w:t>
+      </w:r>
+      <w:r>
+        <w:rPr>
+          <w:rFonts w:hint="eastAsia"/>
+        </w:rPr>
+        <w:t xml:space="preserve"> </w:t>
+      </w:r>
+      <w:r>
+        <w:rPr>
+          <w:rFonts w:hint="eastAsia"/>
+        </w:rPr>
+        <w:t>functionsBeginSize + _</w:t>
+      </w:r>
+      <w:r>
+        <w:rPr>
+          <w:rFonts w:hint="eastAsia"/>
+        </w:rPr>
+        <w:t xml:space="preserve"> </w:t>
+      </w:r>
+      <w:r>
+        <w:rPr>
+          <w:rFonts w:hint="eastAsia"/>
+        </w:rPr>
+        <w:t>functionsLen</w:t>
       </w:r>
     </w:p>
     <w:p>
@@ -1335,104 +1488,175 @@
         <w:rPr>
           <w:rFonts w:hint="eastAsia"/>
         </w:rPr>
-        <w:t xml:space="preserve">  </w:t>
-      </w:r>
-      <w:r>
-        <w:rPr>
-          <w:rFonts w:hint="eastAsia"/>
-        </w:rPr>
-        <w:t>假设</w:t>
-      </w:r>
-      <w:r>
-        <w:rPr>
-          <w:rFonts w:hint="eastAsia"/>
-        </w:rPr>
-        <w:t>总共有两个函数名，</w:t>
-      </w:r>
-      <w:r>
-        <w:rPr>
-          <w:rFonts w:hint="eastAsia"/>
-        </w:rPr>
-        <w:t xml:space="preserve"> A </w:t>
-      </w:r>
-      <w:r>
-        <w:rPr>
-          <w:rFonts w:hint="eastAsia"/>
-        </w:rPr>
-        <w:t>函数名为“</w:t>
-      </w:r>
-      <w:r>
-        <w:rPr>
-          <w:rFonts w:hint="eastAsia"/>
-        </w:rPr>
-        <w:t>abcdef</w:t>
-      </w:r>
-      <w:r>
-        <w:rPr>
-          <w:rFonts w:hint="eastAsia"/>
-        </w:rPr>
-        <w:t>”，</w:t>
-      </w:r>
-      <w:r>
-        <w:rPr>
-          <w:rFonts w:hint="eastAsia"/>
-        </w:rPr>
-        <w:t xml:space="preserve"> B </w:t>
-      </w:r>
-      <w:r>
-        <w:rPr>
-          <w:rFonts w:hint="eastAsia"/>
-        </w:rPr>
-        <w:t>函数名为“</w:t>
-      </w:r>
-      <w:r>
-        <w:rPr>
-          <w:rFonts w:hint="eastAsia"/>
-        </w:rPr>
-        <w:t>ghij</w:t>
-      </w:r>
-      <w:r>
-        <w:rPr>
-          <w:rFonts w:hint="eastAsia"/>
-        </w:rPr>
-        <w:t>”</w:t>
-      </w:r>
-      <w:r>
-        <w:rPr>
-          <w:rFonts w:hint="eastAsia"/>
-        </w:rPr>
-        <w:t>，</w:t>
-      </w:r>
-      <w:r>
-        <w:rPr>
-          <w:rFonts w:hint="eastAsia"/>
-        </w:rPr>
-        <w:t>函数名字符串</w:t>
-      </w:r>
-      <w:r>
-        <w:rPr>
-          <w:rFonts w:hint="eastAsia"/>
-        </w:rPr>
-        <w:t>存储的结构</w:t>
-      </w:r>
-      <w:r>
-        <w:rPr>
-          <w:rFonts w:hint="eastAsia"/>
-        </w:rPr>
-        <w:t>如下图：</w:t>
+        <w:t xml:space="preserve">  traceOff </w:t>
+      </w:r>
+      <w:r>
+        <w:rPr>
+          <w:rFonts w:hint="eastAsia"/>
+        </w:rPr>
+        <w:t>在写入头部信息之后，</w:t>
+      </w:r>
+      <w:r>
+        <w:rPr>
+          <w:rFonts w:hint="eastAsia"/>
+        </w:rPr>
+        <w:t>会</w:t>
+      </w:r>
+      <w:r>
+        <w:rPr>
+          <w:rFonts w:hint="eastAsia"/>
+        </w:rPr>
+        <w:t>读取外部文件的函数名数组，把所有的</w:t>
+      </w:r>
+      <w:r>
+        <w:rPr>
+          <w:rFonts w:hint="eastAsia"/>
+        </w:rPr>
+        <w:t>函数名字符</w:t>
+      </w:r>
+      <w:r>
+        <w:rPr>
+          <w:rFonts w:hint="eastAsia"/>
+        </w:rPr>
+        <w:t>串序列化</w:t>
+      </w:r>
+      <w:r>
+        <w:rPr>
+          <w:rFonts w:hint="eastAsia"/>
+        </w:rPr>
+        <w:t>到文件中，</w:t>
+      </w:r>
+      <w:r>
+        <w:rPr>
+          <w:rFonts w:hint="eastAsia"/>
+        </w:rPr>
+        <w:t>接着</w:t>
+      </w:r>
+      <w:r>
+        <w:rPr>
+          <w:rFonts w:hint="eastAsia"/>
+        </w:rPr>
+        <w:t>再写入</w:t>
+      </w:r>
+      <w:r>
+        <w:rPr>
+          <w:rFonts w:hint="eastAsia"/>
+        </w:rPr>
+        <w:t>跟踪</w:t>
+      </w:r>
+      <w:r>
+        <w:rPr>
+          <w:rFonts w:hint="eastAsia"/>
+        </w:rPr>
+        <w:t>数据。</w:t>
       </w:r>
     </w:p>
     <w:p>
       <w:pPr>
         <w:spacing w:line="360" w:lineRule="auto"/>
+      </w:pPr>
+      <w:r>
+        <w:rPr>
+          <w:rFonts w:hint="eastAsia"/>
+        </w:rPr>
+        <w:t xml:space="preserve">  </w:t>
+      </w:r>
+      <w:r>
+        <w:rPr>
+          <w:rFonts w:hint="eastAsia"/>
+        </w:rPr>
+        <w:t>假设</w:t>
+      </w:r>
+      <w:r>
+        <w:rPr>
+          <w:rFonts w:hint="eastAsia"/>
+        </w:rPr>
+        <w:t>总共有两个函数名，</w:t>
+      </w:r>
+      <w:r>
+        <w:rPr>
+          <w:rFonts w:hint="eastAsia"/>
+        </w:rPr>
+        <w:t xml:space="preserve"> A </w:t>
+      </w:r>
+      <w:r>
+        <w:rPr>
+          <w:rFonts w:hint="eastAsia"/>
+        </w:rPr>
+        <w:t>函数名为“</w:t>
+      </w:r>
+      <w:r>
+        <w:rPr>
+          <w:rFonts w:hint="eastAsia"/>
+        </w:rPr>
+        <w:t>abcdef</w:t>
+      </w:r>
+      <w:r>
+        <w:rPr>
+          <w:rFonts w:hint="eastAsia"/>
+        </w:rPr>
+        <w:t>”，</w:t>
+      </w:r>
+      <w:r>
+        <w:rPr>
+          <w:rFonts w:hint="eastAsia"/>
+        </w:rPr>
+        <w:t xml:space="preserve"> B </w:t>
+      </w:r>
+      <w:r>
+        <w:rPr>
+          <w:rFonts w:hint="eastAsia"/>
+        </w:rPr>
+        <w:t>函数名为“</w:t>
+      </w:r>
+      <w:r>
+        <w:rPr>
+          <w:rFonts w:hint="eastAsia"/>
+        </w:rPr>
+        <w:t>ghij</w:t>
+      </w:r>
+      <w:r>
+        <w:rPr>
+          <w:rFonts w:hint="eastAsia"/>
+        </w:rPr>
+        <w:t>”</w:t>
+      </w:r>
+      <w:r>
+        <w:rPr>
+          <w:rFonts w:hint="eastAsia"/>
+        </w:rPr>
+        <w:t>，</w:t>
+      </w:r>
+      <w:r>
+        <w:rPr>
+          <w:rFonts w:hint="eastAsia"/>
+        </w:rPr>
+        <w:t>函数名字符串</w:t>
+      </w:r>
+      <w:r>
+        <w:rPr>
+          <w:rFonts w:hint="eastAsia"/>
+        </w:rPr>
+        <w:t>存储的结构</w:t>
+      </w:r>
+      <w:r>
+        <w:rPr>
+          <w:rFonts w:hint="eastAsia"/>
+        </w:rPr>
+        <w:t>如下图：</w:t>
+      </w:r>
+    </w:p>
+    <w:p>
+      <w:pPr>
+        <w:spacing w:line="360" w:lineRule="auto"/>
         <w:jc w:val="center"/>
       </w:pPr>
       <w:r>
         <w:object w:dxaOrig="3124" w:dyaOrig="892">
-          <v:shape id="_x0000_i1028" type="#_x0000_t75" style="width:156.35pt;height:44.6pt" o:ole="">
+          <v:shape id="_x0000_i1027" type="#_x0000_t75" style="width:156.35pt;height:44.6pt" o:ole="">
             <v:imagedata r:id="rId15" o:title=""/>
           </v:shape>
-          <o:OLEObject Type="Embed" ProgID="Visio.Drawing.11" ShapeID="_x0000_i1028" DrawAspect="Content" ObjectID="_1607510638" r:id="rId16"/>
+          <o:OLEObject Type="Embed" ProgID="Visio.Drawing.11" ShapeID="_x0000_i1027" DrawAspect="Content" ObjectID="_1607522574" r:id="rId16"/>
         </w:object>
       </w:r>
     </w:p>
@@ -1581,7 +1805,13 @@
         <w:rPr>
           <w:rFonts w:hint="eastAsia"/>
         </w:rPr>
-        <w:t>该功能与之前的版本不兼容。新二进制文件会更新版本号</w:t>
+        <w:t>该功能与之前的版本不兼容。新二进制文件会更新文件</w:t>
+      </w:r>
+      <w:r>
+        <w:rPr>
+          <w:rFonts w:hint="eastAsia"/>
+        </w:rPr>
+        <w:t>版本号</w:t>
       </w:r>
       <w:r>
         <w:rPr>
@@ -2488,6 +2718,7 @@
         <w:rPr>
           <w:rFonts w:hint="eastAsia"/>
         </w:rPr>
+        <w:lastRenderedPageBreak/>
         <w:t>验收</w:t>
       </w:r>
       <w:r>
@@ -2800,7 +3031,6 @@
               <w:spacing w:line="360" w:lineRule="auto"/>
               <w:jc w:val="left"/>
               <w:rPr>
-                <w:rFonts w:hint="eastAsia"/>
                 <w:szCs w:val="21"/>
               </w:rPr>
             </w:pPr>
@@ -2889,9 +3119,8 @@
             <w:r>
               <w:rPr>
                 <w:rFonts w:hint="eastAsia"/>
-                <w:szCs w:val="21"/>
-              </w:rPr>
-              <w:t>0</w:t>
+              </w:rPr>
+              <w:t>{ FuncList : "local" }</w:t>
             </w:r>
             <w:r>
               <w:rPr>
@@ -2955,7 +3184,6 @@
               <w:spacing w:line="360" w:lineRule="auto"/>
               <w:jc w:val="left"/>
               <w:rPr>
-                <w:rFonts w:hint="eastAsia"/>
                 <w:szCs w:val="21"/>
               </w:rPr>
             </w:pPr>
@@ -2977,7 +3205,6 @@
               <w:spacing w:line="360" w:lineRule="auto"/>
               <w:jc w:val="left"/>
               <w:rPr>
-                <w:rFonts w:hint="eastAsia"/>
                 <w:szCs w:val="21"/>
               </w:rPr>
             </w:pPr>
@@ -2999,7 +3226,6 @@
               <w:spacing w:line="360" w:lineRule="auto"/>
               <w:jc w:val="left"/>
               <w:rPr>
-                <w:rFonts w:hint="eastAsia"/>
                 <w:szCs w:val="21"/>
               </w:rPr>
             </w:pPr>
@@ -3082,16 +3308,14 @@
               <w:spacing w:line="360" w:lineRule="auto"/>
               <w:jc w:val="left"/>
               <w:rPr>
-                <w:rFonts w:hint="eastAsia"/>
-                <w:szCs w:val="21"/>
-              </w:rPr>
-            </w:pPr>
-            <w:r>
-              <w:rPr>
-                <w:rFonts w:hint="eastAsia"/>
-                <w:szCs w:val="21"/>
-              </w:rPr>
-              <w:t>1</w:t>
+                <w:szCs w:val="21"/>
+              </w:rPr>
+            </w:pPr>
+            <w:r>
+              <w:rPr>
+                <w:rFonts w:hint="eastAsia"/>
+              </w:rPr>
+              <w:t>{ FuncList : "file" }</w:t>
             </w:r>
             <w:r>
               <w:rPr>
@@ -3111,7 +3335,6 @@
               <w:spacing w:line="360" w:lineRule="auto"/>
               <w:jc w:val="left"/>
               <w:rPr>
-                <w:rFonts w:hint="eastAsia"/>
                 <w:szCs w:val="21"/>
               </w:rPr>
             </w:pPr>
@@ -3212,7 +3435,6 @@
               <w:spacing w:line="360" w:lineRule="auto"/>
               <w:jc w:val="left"/>
               <w:rPr>
-                <w:rFonts w:hint="eastAsia"/>
                 <w:szCs w:val="21"/>
               </w:rPr>
             </w:pPr>
@@ -3301,9 +3523,8 @@
             <w:r>
               <w:rPr>
                 <w:rFonts w:hint="eastAsia"/>
-                <w:szCs w:val="21"/>
-              </w:rPr>
-              <w:t>0</w:t>
+              </w:rPr>
+              <w:t>{ FuncList : "local" }</w:t>
             </w:r>
             <w:r>
               <w:rPr>
@@ -3367,23 +3588,15 @@
               <w:spacing w:line="360" w:lineRule="auto"/>
               <w:jc w:val="left"/>
               <w:rPr>
-                <w:rFonts w:hint="eastAsia"/>
-                <w:szCs w:val="21"/>
-              </w:rPr>
-            </w:pPr>
-            <w:r>
-              <w:rPr>
-                <w:rFonts w:hint="eastAsia"/>
-                <w:szCs w:val="21"/>
-              </w:rPr>
-              <w:t>0</w:t>
-            </w:r>
-            <w:r>
-              <w:rPr>
-                <w:rFonts w:hint="eastAsia"/>
-                <w:szCs w:val="21"/>
-              </w:rPr>
-              <w:t>5</w:t>
+                <w:szCs w:val="21"/>
+              </w:rPr>
+            </w:pPr>
+            <w:r>
+              <w:rPr>
+                <w:rFonts w:hint="eastAsia"/>
+                <w:szCs w:val="21"/>
+              </w:rPr>
+              <w:t>05</w:t>
             </w:r>
           </w:p>
         </w:tc>
@@ -3396,7 +3609,6 @@
               <w:spacing w:line="360" w:lineRule="auto"/>
               <w:jc w:val="left"/>
               <w:rPr>
-                <w:rFonts w:hint="eastAsia"/>
                 <w:szCs w:val="21"/>
               </w:rPr>
             </w:pPr>
@@ -3418,7 +3630,6 @@
               <w:spacing w:line="360" w:lineRule="auto"/>
               <w:jc w:val="left"/>
               <w:rPr>
-                <w:rFonts w:hint="eastAsia"/>
                 <w:szCs w:val="21"/>
               </w:rPr>
             </w:pPr>
@@ -3501,7 +3712,376 @@
               <w:spacing w:line="360" w:lineRule="auto"/>
               <w:jc w:val="left"/>
               <w:rPr>
-                <w:rFonts w:hint="eastAsia"/>
+                <w:szCs w:val="21"/>
+              </w:rPr>
+            </w:pPr>
+            <w:r>
+              <w:rPr>
+                <w:rFonts w:hint="eastAsia"/>
+              </w:rPr>
+              <w:t>{ FuncList : "file" }</w:t>
+            </w:r>
+            <w:r>
+              <w:rPr>
+                <w:rFonts w:hint="eastAsia"/>
+                <w:szCs w:val="21"/>
+              </w:rPr>
+              <w:t>)</w:t>
+            </w:r>
+          </w:p>
+        </w:tc>
+        <w:tc>
+          <w:tcPr>
+            <w:tcW w:w="1751" w:type="dxa"/>
+          </w:tcPr>
+          <w:p>
+            <w:pPr>
+              <w:spacing w:line="360" w:lineRule="auto"/>
+              <w:jc w:val="left"/>
+              <w:rPr>
+                <w:szCs w:val="21"/>
+              </w:rPr>
+            </w:pPr>
+            <w:r>
+              <w:rPr>
+                <w:rFonts w:hint="eastAsia"/>
+                <w:szCs w:val="21"/>
+              </w:rPr>
+              <w:t>成功解析</w:t>
+            </w:r>
+            <w:r>
+              <w:rPr>
+                <w:rFonts w:hint="eastAsia"/>
+                <w:szCs w:val="21"/>
+              </w:rPr>
+              <w:t>dump</w:t>
+            </w:r>
+            <w:r>
+              <w:rPr>
+                <w:rFonts w:hint="eastAsia"/>
+                <w:szCs w:val="21"/>
+              </w:rPr>
+              <w:t>文件</w:t>
+            </w:r>
+            <w:r>
+              <w:rPr>
+                <w:rFonts w:hint="eastAsia"/>
+                <w:szCs w:val="21"/>
+              </w:rPr>
+              <w:t>并输出数据正确的文件</w:t>
+            </w:r>
+          </w:p>
+        </w:tc>
+      </w:tr>
+      <w:tr>
+        <w:tc>
+          <w:tcPr>
+            <w:tcW w:w="1169" w:type="dxa"/>
+          </w:tcPr>
+          <w:p>
+            <w:pPr>
+              <w:spacing w:line="360" w:lineRule="auto"/>
+              <w:jc w:val="left"/>
+              <w:rPr>
+                <w:szCs w:val="21"/>
+              </w:rPr>
+            </w:pPr>
+            <w:r>
+              <w:rPr>
+                <w:rFonts w:hint="eastAsia"/>
+                <w:szCs w:val="21"/>
+              </w:rPr>
+              <w:t>06</w:t>
+            </w:r>
+          </w:p>
+        </w:tc>
+        <w:tc>
+          <w:tcPr>
+            <w:tcW w:w="2126" w:type="dxa"/>
+          </w:tcPr>
+          <w:p>
+            <w:pPr>
+              <w:spacing w:line="360" w:lineRule="auto"/>
+              <w:jc w:val="left"/>
+              <w:rPr>
+                <w:szCs w:val="21"/>
+              </w:rPr>
+            </w:pPr>
+            <w:r>
+              <w:rPr>
+                <w:rFonts w:hint="eastAsia"/>
+                <w:szCs w:val="21"/>
+              </w:rPr>
+              <w:t>老接口解析二进制文件</w:t>
+            </w:r>
+          </w:p>
+        </w:tc>
+        <w:tc>
+          <w:tcPr>
+            <w:tcW w:w="3119" w:type="dxa"/>
+          </w:tcPr>
+          <w:p>
+            <w:pPr>
+              <w:spacing w:line="360" w:lineRule="auto"/>
+              <w:jc w:val="left"/>
+              <w:rPr>
+                <w:szCs w:val="21"/>
+              </w:rPr>
+            </w:pPr>
+            <w:r>
+              <w:rPr>
+                <w:rFonts w:hint="eastAsia"/>
+                <w:szCs w:val="21"/>
+              </w:rPr>
+              <w:t>traceFmt(0</w:t>
+            </w:r>
+            <w:r>
+              <w:rPr>
+                <w:rFonts w:hint="eastAsia"/>
+                <w:szCs w:val="21"/>
+              </w:rPr>
+              <w:t>，</w:t>
+            </w:r>
+            <w:r>
+              <w:rPr>
+                <w:szCs w:val="21"/>
+              </w:rPr>
+              <w:t>“</w:t>
+            </w:r>
+            <w:r>
+              <w:rPr>
+                <w:rFonts w:hint="eastAsia"/>
+                <w:szCs w:val="21"/>
+              </w:rPr>
+              <w:t>path/trace.dump</w:t>
+            </w:r>
+            <w:r>
+              <w:rPr>
+                <w:szCs w:val="21"/>
+              </w:rPr>
+              <w:t>”</w:t>
+            </w:r>
+            <w:r>
+              <w:rPr>
+                <w:rFonts w:hint="eastAsia"/>
+                <w:szCs w:val="21"/>
+              </w:rPr>
+              <w:t>，</w:t>
+            </w:r>
+            <w:r>
+              <w:rPr>
+                <w:rFonts w:hint="eastAsia"/>
+                <w:szCs w:val="21"/>
+              </w:rPr>
+              <w:t xml:space="preserve"> </w:t>
+            </w:r>
+            <w:r>
+              <w:rPr>
+                <w:szCs w:val="21"/>
+              </w:rPr>
+              <w:t>“</w:t>
+            </w:r>
+            <w:r>
+              <w:rPr>
+                <w:rFonts w:hint="eastAsia"/>
+                <w:szCs w:val="21"/>
+              </w:rPr>
+              <w:t>path/trace.output</w:t>
+            </w:r>
+            <w:r>
+              <w:rPr>
+                <w:szCs w:val="21"/>
+              </w:rPr>
+              <w:t>”</w:t>
+            </w:r>
+          </w:p>
+          <w:p>
+            <w:pPr>
+              <w:spacing w:line="360" w:lineRule="auto"/>
+              <w:jc w:val="left"/>
+              <w:rPr>
+                <w:szCs w:val="21"/>
+              </w:rPr>
+            </w:pPr>
+            <w:r>
+              <w:rPr>
+                <w:rFonts w:hint="eastAsia"/>
+                <w:szCs w:val="21"/>
+              </w:rPr>
+              <w:t>)</w:t>
+            </w:r>
+          </w:p>
+        </w:tc>
+        <w:tc>
+          <w:tcPr>
+            <w:tcW w:w="1751" w:type="dxa"/>
+          </w:tcPr>
+          <w:p>
+            <w:pPr>
+              <w:spacing w:line="360" w:lineRule="auto"/>
+              <w:jc w:val="left"/>
+              <w:rPr>
+                <w:szCs w:val="21"/>
+              </w:rPr>
+            </w:pPr>
+            <w:r>
+              <w:rPr>
+                <w:rFonts w:hint="eastAsia"/>
+                <w:szCs w:val="21"/>
+              </w:rPr>
+              <w:t>成功解析</w:t>
+            </w:r>
+            <w:r>
+              <w:rPr>
+                <w:rFonts w:hint="eastAsia"/>
+                <w:szCs w:val="21"/>
+              </w:rPr>
+              <w:t>dump</w:t>
+            </w:r>
+            <w:r>
+              <w:rPr>
+                <w:rFonts w:hint="eastAsia"/>
+                <w:szCs w:val="21"/>
+              </w:rPr>
+              <w:t>文件</w:t>
+            </w:r>
+            <w:r>
+              <w:rPr>
+                <w:rFonts w:hint="eastAsia"/>
+                <w:szCs w:val="21"/>
+              </w:rPr>
+              <w:t>并输出数据正确的文件</w:t>
+            </w:r>
+          </w:p>
+        </w:tc>
+      </w:tr>
+      <w:tr>
+        <w:tc>
+          <w:tcPr>
+            <w:tcW w:w="1169" w:type="dxa"/>
+          </w:tcPr>
+          <w:p>
+            <w:pPr>
+              <w:spacing w:line="360" w:lineRule="auto"/>
+              <w:jc w:val="left"/>
+              <w:rPr>
+                <w:szCs w:val="21"/>
+              </w:rPr>
+            </w:pPr>
+            <w:r>
+              <w:rPr>
+                <w:rFonts w:hint="eastAsia"/>
+                <w:szCs w:val="21"/>
+              </w:rPr>
+              <w:t>07</w:t>
+            </w:r>
+          </w:p>
+        </w:tc>
+        <w:tc>
+          <w:tcPr>
+            <w:tcW w:w="2126" w:type="dxa"/>
+          </w:tcPr>
+          <w:p>
+            <w:pPr>
+              <w:spacing w:line="360" w:lineRule="auto"/>
+              <w:jc w:val="left"/>
+              <w:rPr>
+                <w:szCs w:val="21"/>
+              </w:rPr>
+            </w:pPr>
+            <w:r>
+              <w:rPr>
+                <w:rFonts w:hint="eastAsia"/>
+                <w:szCs w:val="21"/>
+              </w:rPr>
+              <w:t>老接口解析二进制文件</w:t>
+            </w:r>
+          </w:p>
+        </w:tc>
+        <w:tc>
+          <w:tcPr>
+            <w:tcW w:w="3119" w:type="dxa"/>
+          </w:tcPr>
+          <w:p>
+            <w:pPr>
+              <w:spacing w:line="360" w:lineRule="auto"/>
+              <w:jc w:val="left"/>
+              <w:rPr>
+                <w:szCs w:val="21"/>
+              </w:rPr>
+            </w:pPr>
+            <w:r>
+              <w:rPr>
+                <w:rFonts w:hint="eastAsia"/>
+                <w:szCs w:val="21"/>
+              </w:rPr>
+              <w:t>traceFmt(1</w:t>
+            </w:r>
+            <w:r>
+              <w:rPr>
+                <w:rFonts w:hint="eastAsia"/>
+                <w:szCs w:val="21"/>
+              </w:rPr>
+              <w:t>，</w:t>
+            </w:r>
+            <w:r>
+              <w:rPr>
+                <w:szCs w:val="21"/>
+              </w:rPr>
+              <w:t>“</w:t>
+            </w:r>
+            <w:r>
+              <w:rPr>
+                <w:rFonts w:hint="eastAsia"/>
+                <w:szCs w:val="21"/>
+              </w:rPr>
+              <w:t>path/trace.dump</w:t>
+            </w:r>
+            <w:r>
+              <w:rPr>
+                <w:szCs w:val="21"/>
+              </w:rPr>
+              <w:t>”</w:t>
+            </w:r>
+            <w:r>
+              <w:rPr>
+                <w:rFonts w:hint="eastAsia"/>
+                <w:szCs w:val="21"/>
+              </w:rPr>
+              <w:t>，</w:t>
+            </w:r>
+            <w:r>
+              <w:rPr>
+                <w:rFonts w:hint="eastAsia"/>
+                <w:szCs w:val="21"/>
+              </w:rPr>
+              <w:t xml:space="preserve"> </w:t>
+            </w:r>
+            <w:r>
+              <w:rPr>
+                <w:szCs w:val="21"/>
+              </w:rPr>
+              <w:t>“</w:t>
+            </w:r>
+            <w:r>
+              <w:rPr>
+                <w:rFonts w:hint="eastAsia"/>
+                <w:szCs w:val="21"/>
+              </w:rPr>
+              <w:t>path/trace.output</w:t>
+            </w:r>
+            <w:r>
+              <w:rPr>
+                <w:szCs w:val="21"/>
+              </w:rPr>
+              <w:t>”</w:t>
+            </w:r>
+          </w:p>
+          <w:p>
+            <w:pPr>
+              <w:spacing w:line="360" w:lineRule="auto"/>
+              <w:jc w:val="left"/>
+              <w:rPr>
                 <w:szCs w:val="21"/>
               </w:rPr>
             </w:pPr>
@@ -3511,13 +4091,6 @@
                 <w:szCs w:val="21"/>
               </w:rPr>
               <w:lastRenderedPageBreak/>
-              <w:t>1</w:t>
-            </w:r>
-            <w:r>
-              <w:rPr>
-                <w:rFonts w:hint="eastAsia"/>
-                <w:szCs w:val="21"/>
-              </w:rPr>
               <w:t>)</w:t>
             </w:r>
           </w:p>
@@ -3531,7 +4104,6 @@
               <w:spacing w:line="360" w:lineRule="auto"/>
               <w:jc w:val="left"/>
               <w:rPr>
-                <w:rFonts w:hint="eastAsia"/>
                 <w:szCs w:val="21"/>
               </w:rPr>
             </w:pPr>
@@ -3571,381 +4143,6 @@
               </w:rPr>
               <w:lastRenderedPageBreak/>
               <w:t>确的文件</w:t>
-            </w:r>
-          </w:p>
-        </w:tc>
-      </w:tr>
-      <w:tr>
-        <w:tc>
-          <w:tcPr>
-            <w:tcW w:w="1169" w:type="dxa"/>
-          </w:tcPr>
-          <w:p>
-            <w:pPr>
-              <w:spacing w:line="360" w:lineRule="auto"/>
-              <w:jc w:val="left"/>
-              <w:rPr>
-                <w:rFonts w:hint="eastAsia"/>
-                <w:szCs w:val="21"/>
-              </w:rPr>
-            </w:pPr>
-            <w:r>
-              <w:rPr>
-                <w:rFonts w:hint="eastAsia"/>
-                <w:szCs w:val="21"/>
-              </w:rPr>
-              <w:lastRenderedPageBreak/>
-              <w:t>06</w:t>
-            </w:r>
-          </w:p>
-        </w:tc>
-        <w:tc>
-          <w:tcPr>
-            <w:tcW w:w="2126" w:type="dxa"/>
-          </w:tcPr>
-          <w:p>
-            <w:pPr>
-              <w:spacing w:line="360" w:lineRule="auto"/>
-              <w:jc w:val="left"/>
-              <w:rPr>
-                <w:rFonts w:hint="eastAsia"/>
-                <w:szCs w:val="21"/>
-              </w:rPr>
-            </w:pPr>
-            <w:r>
-              <w:rPr>
-                <w:rFonts w:hint="eastAsia"/>
-                <w:szCs w:val="21"/>
-              </w:rPr>
-              <w:t>老接口解析二进制文件</w:t>
-            </w:r>
-          </w:p>
-        </w:tc>
-        <w:tc>
-          <w:tcPr>
-            <w:tcW w:w="3119" w:type="dxa"/>
-          </w:tcPr>
-          <w:p>
-            <w:pPr>
-              <w:spacing w:line="360" w:lineRule="auto"/>
-              <w:jc w:val="left"/>
-              <w:rPr>
-                <w:rFonts w:hint="eastAsia"/>
-                <w:szCs w:val="21"/>
-              </w:rPr>
-            </w:pPr>
-            <w:r>
-              <w:rPr>
-                <w:rFonts w:hint="eastAsia"/>
-                <w:szCs w:val="21"/>
-              </w:rPr>
-              <w:t>traceFmt(0</w:t>
-            </w:r>
-            <w:r>
-              <w:rPr>
-                <w:rFonts w:hint="eastAsia"/>
-                <w:szCs w:val="21"/>
-              </w:rPr>
-              <w:t>，</w:t>
-            </w:r>
-            <w:r>
-              <w:rPr>
-                <w:szCs w:val="21"/>
-              </w:rPr>
-              <w:t>“</w:t>
-            </w:r>
-            <w:r>
-              <w:rPr>
-                <w:rFonts w:hint="eastAsia"/>
-                <w:szCs w:val="21"/>
-              </w:rPr>
-              <w:t>path/trace.dump</w:t>
-            </w:r>
-            <w:r>
-              <w:rPr>
-                <w:szCs w:val="21"/>
-              </w:rPr>
-              <w:t>”</w:t>
-            </w:r>
-            <w:r>
-              <w:rPr>
-                <w:rFonts w:hint="eastAsia"/>
-                <w:szCs w:val="21"/>
-              </w:rPr>
-              <w:t>，</w:t>
-            </w:r>
-            <w:r>
-              <w:rPr>
-                <w:rFonts w:hint="eastAsia"/>
-                <w:szCs w:val="21"/>
-              </w:rPr>
-              <w:t xml:space="preserve"> </w:t>
-            </w:r>
-            <w:r>
-              <w:rPr>
-                <w:szCs w:val="21"/>
-              </w:rPr>
-              <w:t>“</w:t>
-            </w:r>
-            <w:r>
-              <w:rPr>
-                <w:rFonts w:hint="eastAsia"/>
-                <w:szCs w:val="21"/>
-              </w:rPr>
-              <w:t>path/trace.output</w:t>
-            </w:r>
-            <w:r>
-              <w:rPr>
-                <w:szCs w:val="21"/>
-              </w:rPr>
-              <w:t>”</w:t>
-            </w:r>
-          </w:p>
-          <w:p>
-            <w:pPr>
-              <w:spacing w:line="360" w:lineRule="auto"/>
-              <w:jc w:val="left"/>
-              <w:rPr>
-                <w:rFonts w:hint="eastAsia"/>
-                <w:szCs w:val="21"/>
-              </w:rPr>
-            </w:pPr>
-            <w:r>
-              <w:rPr>
-                <w:rFonts w:hint="eastAsia"/>
-                <w:szCs w:val="21"/>
-              </w:rPr>
-              <w:t>)</w:t>
-            </w:r>
-          </w:p>
-        </w:tc>
-        <w:tc>
-          <w:tcPr>
-            <w:tcW w:w="1751" w:type="dxa"/>
-          </w:tcPr>
-          <w:p>
-            <w:pPr>
-              <w:spacing w:line="360" w:lineRule="auto"/>
-              <w:jc w:val="left"/>
-              <w:rPr>
-                <w:rFonts w:hint="eastAsia"/>
-                <w:szCs w:val="21"/>
-              </w:rPr>
-            </w:pPr>
-            <w:r>
-              <w:rPr>
-                <w:rFonts w:hint="eastAsia"/>
-                <w:szCs w:val="21"/>
-              </w:rPr>
-              <w:t>成功解析</w:t>
-            </w:r>
-            <w:r>
-              <w:rPr>
-                <w:rFonts w:hint="eastAsia"/>
-                <w:szCs w:val="21"/>
-              </w:rPr>
-              <w:t>dump</w:t>
-            </w:r>
-            <w:r>
-              <w:rPr>
-                <w:rFonts w:hint="eastAsia"/>
-                <w:szCs w:val="21"/>
-              </w:rPr>
-              <w:t>文件</w:t>
-            </w:r>
-            <w:r>
-              <w:rPr>
-                <w:rFonts w:hint="eastAsia"/>
-                <w:szCs w:val="21"/>
-              </w:rPr>
-              <w:t>并输出数据正确的文件</w:t>
-            </w:r>
-          </w:p>
-        </w:tc>
-      </w:tr>
-      <w:tr>
-        <w:tc>
-          <w:tcPr>
-            <w:tcW w:w="1169" w:type="dxa"/>
-          </w:tcPr>
-          <w:p>
-            <w:pPr>
-              <w:spacing w:line="360" w:lineRule="auto"/>
-              <w:jc w:val="left"/>
-              <w:rPr>
-                <w:rFonts w:hint="eastAsia"/>
-                <w:szCs w:val="21"/>
-              </w:rPr>
-            </w:pPr>
-            <w:r>
-              <w:rPr>
-                <w:rFonts w:hint="eastAsia"/>
-                <w:szCs w:val="21"/>
-              </w:rPr>
-              <w:t>07</w:t>
-            </w:r>
-          </w:p>
-        </w:tc>
-        <w:tc>
-          <w:tcPr>
-            <w:tcW w:w="2126" w:type="dxa"/>
-          </w:tcPr>
-          <w:p>
-            <w:pPr>
-              <w:spacing w:line="360" w:lineRule="auto"/>
-              <w:jc w:val="left"/>
-              <w:rPr>
-                <w:rFonts w:hint="eastAsia"/>
-                <w:szCs w:val="21"/>
-              </w:rPr>
-            </w:pPr>
-            <w:r>
-              <w:rPr>
-                <w:rFonts w:hint="eastAsia"/>
-                <w:szCs w:val="21"/>
-              </w:rPr>
-              <w:t>老接口解析二进制文件</w:t>
-            </w:r>
-          </w:p>
-        </w:tc>
-        <w:tc>
-          <w:tcPr>
-            <w:tcW w:w="3119" w:type="dxa"/>
-          </w:tcPr>
-          <w:p>
-            <w:pPr>
-              <w:spacing w:line="360" w:lineRule="auto"/>
-              <w:jc w:val="left"/>
-              <w:rPr>
-                <w:rFonts w:hint="eastAsia"/>
-                <w:szCs w:val="21"/>
-              </w:rPr>
-            </w:pPr>
-            <w:r>
-              <w:rPr>
-                <w:rFonts w:hint="eastAsia"/>
-                <w:szCs w:val="21"/>
-              </w:rPr>
-              <w:t>traceFmt(1</w:t>
-            </w:r>
-            <w:r>
-              <w:rPr>
-                <w:rFonts w:hint="eastAsia"/>
-                <w:szCs w:val="21"/>
-              </w:rPr>
-              <w:t>，</w:t>
-            </w:r>
-            <w:r>
-              <w:rPr>
-                <w:szCs w:val="21"/>
-              </w:rPr>
-              <w:t>“</w:t>
-            </w:r>
-            <w:r>
-              <w:rPr>
-                <w:rFonts w:hint="eastAsia"/>
-                <w:szCs w:val="21"/>
-              </w:rPr>
-              <w:t>path/trace.dump</w:t>
-            </w:r>
-            <w:r>
-              <w:rPr>
-                <w:szCs w:val="21"/>
-              </w:rPr>
-              <w:t>”</w:t>
-            </w:r>
-            <w:r>
-              <w:rPr>
-                <w:rFonts w:hint="eastAsia"/>
-                <w:szCs w:val="21"/>
-              </w:rPr>
-              <w:t>，</w:t>
-            </w:r>
-            <w:r>
-              <w:rPr>
-                <w:rFonts w:hint="eastAsia"/>
-                <w:szCs w:val="21"/>
-              </w:rPr>
-              <w:t xml:space="preserve"> </w:t>
-            </w:r>
-            <w:r>
-              <w:rPr>
-                <w:szCs w:val="21"/>
-              </w:rPr>
-              <w:t>“</w:t>
-            </w:r>
-            <w:r>
-              <w:rPr>
-                <w:rFonts w:hint="eastAsia"/>
-                <w:szCs w:val="21"/>
-              </w:rPr>
-              <w:t>path/trace.output</w:t>
-            </w:r>
-            <w:r>
-              <w:rPr>
-                <w:szCs w:val="21"/>
-              </w:rPr>
-              <w:t>”</w:t>
-            </w:r>
-          </w:p>
-          <w:p>
-            <w:pPr>
-              <w:spacing w:line="360" w:lineRule="auto"/>
-              <w:jc w:val="left"/>
-              <w:rPr>
-                <w:rFonts w:hint="eastAsia"/>
-                <w:szCs w:val="21"/>
-              </w:rPr>
-            </w:pPr>
-            <w:r>
-              <w:rPr>
-                <w:rFonts w:hint="eastAsia"/>
-                <w:szCs w:val="21"/>
-              </w:rPr>
-              <w:t>)</w:t>
-            </w:r>
-          </w:p>
-        </w:tc>
-        <w:tc>
-          <w:tcPr>
-            <w:tcW w:w="1751" w:type="dxa"/>
-          </w:tcPr>
-          <w:p>
-            <w:pPr>
-              <w:spacing w:line="360" w:lineRule="auto"/>
-              <w:jc w:val="left"/>
-              <w:rPr>
-                <w:rFonts w:hint="eastAsia"/>
-                <w:szCs w:val="21"/>
-              </w:rPr>
-            </w:pPr>
-            <w:r>
-              <w:rPr>
-                <w:rFonts w:hint="eastAsia"/>
-                <w:szCs w:val="21"/>
-              </w:rPr>
-              <w:t>成功解析</w:t>
-            </w:r>
-            <w:r>
-              <w:rPr>
-                <w:rFonts w:hint="eastAsia"/>
-                <w:szCs w:val="21"/>
-              </w:rPr>
-              <w:t>dump</w:t>
-            </w:r>
-            <w:r>
-              <w:rPr>
-                <w:rFonts w:hint="eastAsia"/>
-                <w:szCs w:val="21"/>
-              </w:rPr>
-              <w:t>文件</w:t>
-            </w:r>
-            <w:r>
-              <w:rPr>
-                <w:rFonts w:hint="eastAsia"/>
-                <w:szCs w:val="21"/>
-              </w:rPr>
-              <w:t>并输出数据正确的文件</w:t>
             </w:r>
           </w:p>
         </w:tc>
@@ -5059,6 +5256,7 @@
   <w:style w:type="character" w:default="1" w:styleId="DefaultParagraphFont">
     <w:name w:val="Default Paragraph Font"/>
     <w:uiPriority w:val="1"/>
+    <w:semiHidden/>
     <w:unhideWhenUsed/>
   </w:style>
   <w:style w:type="table" w:default="1" w:styleId="TableNormal">

</xml_diff>